<commit_message>
Complete rewrite v2.0: Fix navigation & SSE bugs, simplify 3-step flow, 4000+ words/subtopic prompts
</commit_message>
<xml_diff>
--- a/templates/master_book_template.docx
+++ b/templates/master_book_template.docx
@@ -3,6 +3,7 @@
 <w:document xmlns:wpc="http://schemas.microsoft.com/office/word/2010/wordprocessingCanvas" xmlns:mo="http://schemas.microsoft.com/office/mac/office/2008/main" xmlns:mc="http://schemas.openxmlformats.org/markup-compatibility/2006" xmlns:mv="urn:schemas-microsoft-com:mac:vml" xmlns:o="urn:schemas-microsoft-com:office:office" xmlns:r="http://schemas.openxmlformats.org/officeDocument/2006/relationships" xmlns:m="http://schemas.openxmlformats.org/officeDocument/2006/math" xmlns:v="urn:schemas-microsoft-com:vml" xmlns:wp14="http://schemas.microsoft.com/office/word/2010/wordprocessingDrawing" xmlns:wp="http://schemas.openxmlformats.org/drawingml/2006/wordprocessingDrawing" xmlns:w10="urn:schemas-microsoft-com:office:word" xmlns:w="http://schemas.openxmlformats.org/wordprocessingml/2006/main" xmlns:w14="http://schemas.microsoft.com/office/word/2010/wordml" xmlns:wpg="http://schemas.microsoft.com/office/word/2010/wordprocessingGroup" xmlns:wpi="http://schemas.microsoft.com/office/word/2010/wordprocessingInk" xmlns:wne="http://schemas.microsoft.com/office/word/2006/wordml" xmlns:wps="http://schemas.microsoft.com/office/word/2010/wordprocessingShape" mc:Ignorable="w14 wp14">
   <w:body>
     <w:sectPr>
+      <w:footerReference w:type="default" r:id="rId9"/>
       <w:pgSz w:w="12240" w:h="15840"/>
       <w:pgMar w:top="1440" w:right="1440" w:bottom="1440" w:left="1440" w:header="720" w:footer="720" w:gutter="0"/>
       <w:cols w:space="720"/>
@@ -10,6 +11,28 @@
     </w:sectPr>
   </w:body>
 </w:document>
+</file>
+
+<file path=word/footer1.xml><?xml version="1.0" encoding="utf-8"?>
+<w:ftr xmlns:m="http://schemas.openxmlformats.org/officeDocument/2006/math" xmlns:mc="http://schemas.openxmlformats.org/markup-compatibility/2006" xmlns:mo="http://schemas.microsoft.com/office/mac/office/2008/main" xmlns:mv="urn:schemas-microsoft-com:mac:vml" xmlns:o="urn:schemas-microsoft-com:office:office" xmlns:r="http://schemas.openxmlformats.org/officeDocument/2006/relationships" xmlns:v="urn:schemas-microsoft-com:vml" xmlns:w10="urn:schemas-microsoft-com:office:word" xmlns:w14="http://schemas.microsoft.com/office/word/2010/wordml" xmlns:w="http://schemas.openxmlformats.org/wordprocessingml/2006/main" xmlns:wne="http://schemas.microsoft.com/office/word/2006/wordml" xmlns:wp14="http://schemas.microsoft.com/office/word/2010/wordprocessingDrawing" xmlns:wp="http://schemas.openxmlformats.org/drawingml/2006/wordprocessingDrawing" xmlns:wpc="http://schemas.microsoft.com/office/word/2010/wordprocessingCanvas" xmlns:wpg="http://schemas.microsoft.com/office/word/2010/wordprocessingGroup" xmlns:wpi="http://schemas.microsoft.com/office/word/2010/wordprocessingInk" xmlns:wps="http://schemas.microsoft.com/office/word/2010/wordprocessingShape" mc:Ignorable="w14 wp14">
+  <w:p>
+    <w:pPr>
+      <w:pStyle w:val="Footer"/>
+      <w:jc w:val="center"/>
+    </w:pPr>
+    <w:r>
+      <w:rPr>
+        <w:rFonts w:ascii="Times New Roman" w:hAnsi="Times New Roman"/>
+        <w:color w:val="718096"/>
+        <w:sz w:val="20"/>
+      </w:rPr>
+      <w:fldChar w:fldCharType="begin"/>
+      <w:instrText xml:space="preserve">PAGE</w:instrText>
+      <w:fldChar w:fldCharType="separate"/>
+      <w:fldChar w:fldCharType="end"/>
+    </w:r>
+  </w:p>
+</w:ftr>
 </file>
 
 <file path=word/numbering.xml><?xml version="1.0" encoding="utf-8"?>
@@ -376,7 +399,7 @@
     <w:qFormat/>
     <w:rsid w:val="00FC693F"/>
     <w:pPr>
-      <w:spacing w:line="360" w:lineRule="auto" w:after="160"/>
+      <w:spacing w:line="360" w:lineRule="auto" w:after="120"/>
     </w:pPr>
     <w:rPr>
       <w:rFonts w:ascii="Times New Roman" w:hAnsi="Times New Roman"/>
@@ -439,7 +462,7 @@
     <w:pPr>
       <w:keepNext/>
       <w:keepLines/>
-      <w:spacing w:before="480" w:after="240"/>
+      <w:spacing w:before="360" w:after="240"/>
       <w:outlineLvl w:val="0"/>
     </w:pPr>
     <w:rPr>
@@ -464,7 +487,7 @@
     <w:pPr>
       <w:keepNext/>
       <w:keepLines/>
-      <w:spacing w:before="320" w:after="160"/>
+      <w:spacing w:before="280" w:after="120"/>
       <w:outlineLvl w:val="1"/>
     </w:pPr>
     <w:rPr>
@@ -473,7 +496,7 @@
       <w:bCs/>
       <w:i w:val="0"/>
       <w:color w:val="2B6CB0"/>
-      <w:sz w:val="30"/>
+      <w:sz w:val="28"/>
       <w:szCs w:val="26"/>
     </w:rPr>
   </w:style>
@@ -489,7 +512,7 @@
     <w:pPr>
       <w:keepNext/>
       <w:keepLines/>
-      <w:spacing w:before="240" w:after="120"/>
+      <w:spacing w:before="200" w:after="80"/>
       <w:outlineLvl w:val="2"/>
     </w:pPr>
     <w:rPr>
@@ -497,8 +520,8 @@
       <w:b/>
       <w:bCs/>
       <w:i/>
-      <w:color w:val="2D3748"/>
-      <w:sz w:val="26"/>
+      <w:color w:val="4A5568"/>
+      <w:sz w:val="24"/>
     </w:rPr>
   </w:style>
   <w:style w:type="paragraph" w:styleId="Heading4">
@@ -1175,13 +1198,16 @@
     <w:qFormat/>
     <w:rsid w:val="00FC693F"/>
     <w:pPr>
-      <w:spacing w:line="240" w:lineRule="auto"/>
+      <w:spacing w:line="240" w:lineRule="auto" w:before="80" w:after="240"/>
+      <w:jc w:val="center"/>
     </w:pPr>
     <w:rPr>
+      <w:rFonts w:ascii="Times New Roman" w:hAnsi="Times New Roman"/>
       <w:b/>
       <w:bCs/>
-      <w:color w:val="4F81BD" w:themeColor="accent1"/>
-      <w:sz w:val="18"/>
+      <w:i/>
+      <w:color w:val="4A5568"/>
+      <w:sz w:val="20"/>
       <w:szCs w:val="18"/>
     </w:rPr>
   </w:style>

</xml_diff>